<commit_message>
Procedimiento GRIS: correcciones de la revisión
- Se quitan responsable del proceso, responsabilidades, toma de conocimiento
  y contenido de registros y documentos de referencia.
- Rampa en lugar de TPD, control box, tablero EL CID y DE/NDE.
- Riesgos principales, documentos asociados (ZIT003, ZRQ001) y convenciones
  de referencia (ranura 1, sentido de avance, cero axial).
- Checklist de desprendimiento pre y post-ensayo; equipamiento según packing list.
- Pasos numerados automáticamente; el anexo calcula los apartados que lo invocan.

Co-Authored-By: Claude Opus 5.5 <noreply@anthropic.com>
Claude-Session: https://claude.ai/code/session_01Nz5qZw2jp5HghH6VEfj4aK
</commit_message>
<xml_diff>
--- a/procedimientos_gris/00503-00-EPG002 Anexo Protocolos de Ensayo EL CID.docx
+++ b/procedimientos_gris/00503-00-EPG002 Anexo Protocolos de Ensayo EL CID.docx
@@ -80,28 +80,6 @@
     </w:p>
     <w:p>
       <w:pPr>
-        <w:pStyle w:val="Heading1"/>
-        <w:keepNext/>
-        <w:spacing w:after="60" w:before="200"/>
-      </w:pPr>
-      <w:r>
-        <w:rPr>
-          <w:color w:val="6D8289"/>
-        </w:rPr>
-        <w:t xml:space="preserve">RESPONSABLE DEL PROCESO</w:t>
-      </w:r>
-    </w:p>
-    <w:p>
-      <w:pPr>
-        <w:spacing w:after="100" w:line="264"/>
-        <w:jc w:val="both"/>
-      </w:pPr>
-      <w:r>
-        <w:t xml:space="preserve">Gerente de Operaciones e Ingeniería.</w:t>
-      </w:r>
-    </w:p>
-    <w:p>
-      <w:pPr>
         <w:pBdr>
           <w:bottom w:val="single" w:color="E36C0A" w:sz="8" w:space="1"/>
         </w:pBdr>
@@ -196,14 +174,14 @@
           <w:b/>
           <w:sz w:val="20"/>
         </w:rPr>
-        <w:t xml:space="preserve">RESPONSABLE DEL PROCESO</w:t>
+        <w:t xml:space="preserve">1. DEFINICIONES</w:t>
       </w:r>
       <w:r>
         <w:rPr>
           <w:sz w:val="19"/>
         </w:rPr>
         <w:tab/>
-        <w:t>1</w:t>
+        <w:t>3</w:t>
       </w:r>
     </w:p>
     <w:p>
@@ -219,7 +197,7 @@
           <w:b/>
           <w:sz w:val="20"/>
         </w:rPr>
-        <w:t xml:space="preserve">1. DEFINICIONES</w:t>
+        <w:t xml:space="preserve">2. CONTENIDO</w:t>
       </w:r>
       <w:r>
         <w:rPr>
@@ -227,6 +205,94 @@
         </w:rPr>
         <w:tab/>
         <w:t>3</w:t>
+      </w:r>
+    </w:p>
+    <w:p>
+      <w:pPr>
+        <w:tabs>
+          <w:tab w:val="right" w:leader="dot" w:pos="9638"/>
+        </w:tabs>
+        <w:spacing w:after="30"/>
+        <w:ind w:left="425"/>
+      </w:pPr>
+      <w:r>
+        <w:rPr>
+          <w:sz w:val="19"/>
+        </w:rPr>
+        <w:t xml:space="preserve">2.1 PROTOCOLO 1 – EXCITACIÓN DEL NÚCLEO</w:t>
+      </w:r>
+      <w:r>
+        <w:rPr>
+          <w:sz w:val="19"/>
+        </w:rPr>
+        <w:tab/>
+        <w:t>3</w:t>
+      </w:r>
+    </w:p>
+    <w:p>
+      <w:pPr>
+        <w:tabs>
+          <w:tab w:val="right" w:leader="dot" w:pos="9638"/>
+        </w:tabs>
+        <w:spacing w:after="30"/>
+        <w:ind w:left="425"/>
+      </w:pPr>
+      <w:r>
+        <w:rPr>
+          <w:sz w:val="19"/>
+        </w:rPr>
+        <w:t xml:space="preserve">2.2 PROTOCOLO 2 – CALIBRACIÓN</w:t>
+      </w:r>
+      <w:r>
+        <w:rPr>
+          <w:sz w:val="19"/>
+        </w:rPr>
+        <w:tab/>
+        <w:t>5</w:t>
+      </w:r>
+    </w:p>
+    <w:p>
+      <w:pPr>
+        <w:tabs>
+          <w:tab w:val="right" w:leader="dot" w:pos="9638"/>
+        </w:tabs>
+        <w:spacing w:after="30"/>
+        <w:ind w:left="425"/>
+      </w:pPr>
+      <w:r>
+        <w:rPr>
+          <w:sz w:val="19"/>
+        </w:rPr>
+        <w:t xml:space="preserve">2.3 PROTOCOLO 3 – OPERACIÓN DEL SOFTWARE ELCSOFT</w:t>
+      </w:r>
+      <w:r>
+        <w:rPr>
+          <w:sz w:val="19"/>
+        </w:rPr>
+        <w:tab/>
+        <w:t>5</w:t>
+      </w:r>
+    </w:p>
+    <w:p>
+      <w:pPr>
+        <w:tabs>
+          <w:tab w:val="right" w:leader="dot" w:pos="9638"/>
+        </w:tabs>
+        <w:spacing w:after="30"/>
+        <w:ind w:left="425"/>
+      </w:pPr>
+      <w:r>
+        <w:rPr>
+          <w:sz w:val="19"/>
+        </w:rPr>
+        <w:t xml:space="preserve">2.4 APÉNDICE – DETERMINACIÓN DE LA TENSIÓN POR ESPIRA</w:t>
+      </w:r>
+      <w:r>
+        <w:rPr>
+          <w:sz w:val="19"/>
+        </w:rPr>
+        <w:tab/>
+        <w:t>10</w:t>
       </w:r>
     </w:p>
     <w:p>
@@ -242,141 +308,7 @@
           <w:b/>
           <w:sz w:val="20"/>
         </w:rPr>
-        <w:t xml:space="preserve">2. RESPONSABILIDADES</w:t>
-      </w:r>
-      <w:r>
-        <w:rPr>
-          <w:sz w:val="19"/>
-        </w:rPr>
-        <w:tab/>
-        <w:t>3</w:t>
-      </w:r>
-    </w:p>
-    <w:p>
-      <w:pPr>
-        <w:tabs>
-          <w:tab w:val="right" w:leader="dot" w:pos="9638"/>
-        </w:tabs>
-        <w:spacing w:after="60"/>
-        <w:ind w:left="0"/>
-      </w:pPr>
-      <w:r>
-        <w:rPr>
-          <w:b/>
-          <w:sz w:val="20"/>
-        </w:rPr>
-        <w:t xml:space="preserve">3. CONTENIDO</w:t>
-      </w:r>
-      <w:r>
-        <w:rPr>
-          <w:sz w:val="19"/>
-        </w:rPr>
-        <w:tab/>
-        <w:t>3</w:t>
-      </w:r>
-    </w:p>
-    <w:p>
-      <w:pPr>
-        <w:tabs>
-          <w:tab w:val="right" w:leader="dot" w:pos="9638"/>
-        </w:tabs>
-        <w:spacing w:after="30"/>
-        <w:ind w:left="425"/>
-      </w:pPr>
-      <w:r>
-        <w:rPr>
-          <w:sz w:val="19"/>
-        </w:rPr>
-        <w:t xml:space="preserve">3.1 PROTOCOLO 1 – EXCITACIÓN DEL NÚCLEO</w:t>
-      </w:r>
-      <w:r>
-        <w:rPr>
-          <w:sz w:val="19"/>
-        </w:rPr>
-        <w:tab/>
-        <w:t>3</w:t>
-      </w:r>
-    </w:p>
-    <w:p>
-      <w:pPr>
-        <w:tabs>
-          <w:tab w:val="right" w:leader="dot" w:pos="9638"/>
-        </w:tabs>
-        <w:spacing w:after="30"/>
-        <w:ind w:left="425"/>
-      </w:pPr>
-      <w:r>
-        <w:rPr>
-          <w:sz w:val="19"/>
-        </w:rPr>
-        <w:t xml:space="preserve">3.2 PROTOCOLO 2 – CALIBRACIÓN</w:t>
-      </w:r>
-      <w:r>
-        <w:rPr>
-          <w:sz w:val="19"/>
-        </w:rPr>
-        <w:tab/>
-        <w:t>5</w:t>
-      </w:r>
-    </w:p>
-    <w:p>
-      <w:pPr>
-        <w:tabs>
-          <w:tab w:val="right" w:leader="dot" w:pos="9638"/>
-        </w:tabs>
-        <w:spacing w:after="30"/>
-        <w:ind w:left="425"/>
-      </w:pPr>
-      <w:r>
-        <w:rPr>
-          <w:sz w:val="19"/>
-        </w:rPr>
-        <w:t xml:space="preserve">3.3 PROTOCOLO 3 – OPERACIÓN DEL SOFTWARE ELCSOFT</w:t>
-      </w:r>
-      <w:r>
-        <w:rPr>
-          <w:sz w:val="19"/>
-        </w:rPr>
-        <w:tab/>
-        <w:t>6</w:t>
-      </w:r>
-    </w:p>
-    <w:p>
-      <w:pPr>
-        <w:tabs>
-          <w:tab w:val="right" w:leader="dot" w:pos="9638"/>
-        </w:tabs>
-        <w:spacing w:after="30"/>
-        <w:ind w:left="425"/>
-      </w:pPr>
-      <w:r>
-        <w:rPr>
-          <w:sz w:val="19"/>
-        </w:rPr>
-        <w:t xml:space="preserve">3.4 APÉNDICE – DETERMINACIÓN DE LA TENSIÓN POR ESPIRA</w:t>
-      </w:r>
-      <w:r>
-        <w:rPr>
-          <w:sz w:val="19"/>
-        </w:rPr>
-        <w:tab/>
-        <w:t>10</w:t>
-      </w:r>
-    </w:p>
-    <w:p>
-      <w:pPr>
-        <w:tabs>
-          <w:tab w:val="right" w:leader="dot" w:pos="9638"/>
-        </w:tabs>
-        <w:spacing w:after="60"/>
-        <w:ind w:left="0"/>
-      </w:pPr>
-      <w:r>
-        <w:rPr>
-          <w:b/>
-          <w:sz w:val="20"/>
-        </w:rPr>
-        <w:t xml:space="preserve">4. REGISTROS</w:t>
+        <w:t xml:space="preserve">3. REGISTROS</w:t>
       </w:r>
       <w:r>
         <w:rPr>
@@ -1141,77 +1073,7 @@
         <w:spacing w:after="140" w:before="280"/>
       </w:pPr>
       <w:r>
-        <w:t xml:space="preserve">2. RESPONSABILIDADES</w:t>
-      </w:r>
-    </w:p>
-    <w:p>
-      <w:pPr>
-        <w:keepNext/>
-        <w:spacing w:after="40" w:before="140"/>
-      </w:pPr>
-      <w:r>
-        <w:rPr>
-          <w:b/>
-          <w:bCs/>
-          <w:i/>
-          <w:iCs/>
-          <w:u w:val="single"/>
-        </w:rPr>
-        <w:t xml:space="preserve">Ingeniero de Generadores (IG)</w:t>
-      </w:r>
-    </w:p>
-    <w:p>
-      <w:pPr>
-        <w:pStyle w:val="ListParagraph"/>
-        <w:numPr>
-          <w:ilvl w:val="0"/>
-          <w:numId w:val="2"/>
-        </w:numPr>
-        <w:spacing w:after="60" w:line="264"/>
-        <w:jc w:val="both"/>
-      </w:pPr>
-      <w:r>
-        <w:t xml:space="preserve">Calcular la excitación del núcleo (Protocolo 1) y validar la calibración (Protocolo 2).</w:t>
-      </w:r>
-    </w:p>
-    <w:p>
-      <w:pPr>
-        <w:keepNext/>
-        <w:spacing w:after="40" w:before="140"/>
-      </w:pPr>
-      <w:r>
-        <w:rPr>
-          <w:b/>
-          <w:bCs/>
-          <w:i/>
-          <w:iCs/>
-          <w:u w:val="single"/>
-        </w:rPr>
-        <w:t xml:space="preserve">Responsable del Ensayo (RE)</w:t>
-      </w:r>
-    </w:p>
-    <w:p>
-      <w:pPr>
-        <w:pStyle w:val="ListParagraph"/>
-        <w:numPr>
-          <w:ilvl w:val="0"/>
-          <w:numId w:val="2"/>
-        </w:numPr>
-        <w:spacing w:after="60" w:line="264"/>
-        <w:jc w:val="both"/>
-      </w:pPr>
-      <w:r>
-        <w:t xml:space="preserve">Aplicar los protocolos en sitio, registrar la calibración y resguardar los archivos generados por ELCSoft.</w:t>
-      </w:r>
-    </w:p>
-    <w:p>
-      <w:pPr>
-        <w:pStyle w:val="Heading1"/>
-        <w:keepNext/>
-        <w:spacing w:after="140" w:before="280"/>
-      </w:pPr>
-      <w:r>
-        <w:t xml:space="preserve">3. CONTENIDO</w:t>
+        <w:t xml:space="preserve">2. CONTENIDO</w:t>
       </w:r>
     </w:p>
     <w:p>
@@ -1447,7 +1309,7 @@
                 <w:sz w:val="19"/>
                 <w:szCs w:val="19"/>
               </w:rPr>
-              <w:t xml:space="preserve">Pasos 6, 7, 10, 15, 18 y 25</w:t>
+              <w:t xml:space="preserve">Apartados 2.5, 2.6, 2.7, 2.8</w:t>
             </w:r>
           </w:p>
         </w:tc>
@@ -1551,7 +1413,7 @@
                 <w:sz w:val="19"/>
                 <w:szCs w:val="19"/>
               </w:rPr>
-              <w:t xml:space="preserve">Pasos 13, 34, 40 y 44</w:t>
+              <w:t xml:space="preserve">Apartados 2.6, 2.9, 2.10</w:t>
             </w:r>
           </w:p>
         </w:tc>
@@ -1655,7 +1517,7 @@
                 <w:sz w:val="19"/>
                 <w:szCs w:val="19"/>
               </w:rPr>
-              <w:t xml:space="preserve">Pasos 27, 37 y 39</w:t>
+              <w:t xml:space="preserve">Apartados 2.8, 2.10</w:t>
             </w:r>
           </w:p>
         </w:tc>
@@ -1668,7 +1530,7 @@
         <w:spacing w:after="100" w:before="220"/>
       </w:pPr>
       <w:r>
-        <w:t xml:space="preserve">3.1 PROTOCOLO 1 – EXCITACIÓN DEL NÚCLEO</w:t>
+        <w:t xml:space="preserve">2.1 PROTOCOLO 1 – EXCITACIÓN DEL NÚCLEO</w:t>
       </w:r>
     </w:p>
     <w:p>
@@ -1687,7 +1549,7 @@
         <w:spacing w:after="80" w:before="160"/>
       </w:pPr>
       <w:r>
-        <w:t xml:space="preserve">3.1.1 Características técnicas del equipo</w:t>
+        <w:t xml:space="preserve">2.1.1 Características técnicas del equipo</w:t>
       </w:r>
     </w:p>
     <w:tbl>
@@ -2427,7 +2289,7 @@
         <w:spacing w:after="80" w:before="160"/>
       </w:pPr>
       <w:r>
-        <w:t xml:space="preserve">3.1.2 Puesta a tierra</w:t>
+        <w:t xml:space="preserve">2.1.2 Puesta a tierra</w:t>
       </w:r>
     </w:p>
     <w:tbl>
@@ -2477,7 +2339,7 @@
               <w:t xml:space="preserve">Precaución: </w:t>
             </w:r>
             <w:r>
-              <w:t xml:space="preserve">la puesta a tierra se realiza en forma local desde el estator de la máquina y se distribuye radialmente hacia cada equipo del ensayo. El borne «Ground» del equipo EL CID es su única vinculación a tierra: no se admite ninguna otra conexión paralela o secundaria. Esta disposición evita lazos de corriente que inducen señales espurias y ponen en riesgo los equipos conectados.</w:t>
+              <w:t xml:space="preserve">la puesta a tierra se realiza en forma local desde el estator de la máquina y se distribuye radialmente hacia cada equipo del ensayo. El borne «Ground» del tablero EL CID es su única vinculación a tierra: no se admite ninguna otra conexión paralela o secundaria. Esta disposición evita lazos de corriente que inducen señales espurias y ponen en riesgo los equipos conectados.</w:t>
             </w:r>
           </w:p>
         </w:tc>
@@ -2490,7 +2352,7 @@
         <w:spacing w:after="80" w:before="160"/>
       </w:pPr>
       <w:r>
-        <w:t xml:space="preserve">3.1.3 Cálculo del número de espiras</w:t>
+        <w:t xml:space="preserve">2.1.3 Cálculo del número de espiras</w:t>
       </w:r>
     </w:p>
     <w:p>
@@ -2499,7 +2361,7 @@
         <w:jc w:val="both"/>
       </w:pPr>
       <w:r>
-        <w:t xml:space="preserve">El número de espiras se determina a partir de la tensión por espira calculada según el apartado 3.4 (Apéndice), considerando que:</w:t>
+        <w:t xml:space="preserve">El número de espiras se determina a partir de la tensión por espira calculada según el apartado 2.4 (Apéndice), considerando que:</w:t>
       </w:r>
     </w:p>
     <w:p>
@@ -2547,7 +2409,7 @@
         <w:spacing w:after="80" w:before="160"/>
       </w:pPr>
       <w:r>
-        <w:t xml:space="preserve">3.1.4 Selección de la sección del conductor</w:t>
+        <w:t xml:space="preserve">2.1.4 Selección de la sección del conductor</w:t>
       </w:r>
     </w:p>
     <w:p>
@@ -2566,7 +2428,7 @@
         <w:spacing w:after="80" w:before="160"/>
       </w:pPr>
       <w:r>
-        <w:t xml:space="preserve">3.1.5 Montaje con rotor desmontado</w:t>
+        <w:t xml:space="preserve">2.1.5 Montaje con rotor desmontado</w:t>
       </w:r>
     </w:p>
     <w:p>
@@ -2618,7 +2480,7 @@
         <w:spacing w:after="80" w:before="160"/>
       </w:pPr>
       <w:r>
-        <w:t xml:space="preserve">3.1.6 Montaje con rotor colocado</w:t>
+        <w:t xml:space="preserve">2.1.6 Montaje con rotor colocado</w:t>
       </w:r>
     </w:p>
     <w:p>
@@ -2710,7 +2572,7 @@
               <w:t xml:space="preserve">Inspección GRIS: </w:t>
             </w:r>
             <w:r>
-              <w:t xml:space="preserve">la ubicación inicial y la reubicación del arrollamiento cada 120° se realizan según 00503-00-EPG001, pasos 16, 17 y 44.</w:t>
+              <w:t xml:space="preserve">la ubicación inicial y la reubicación del arrollamiento cada 120° se realizan según 00503-00-EPG001, apartados 2.7 (montaje de la excitación) y 2.10 (inspección por ranura).</w:t>
             </w:r>
           </w:p>
         </w:tc>
@@ -2723,7 +2585,7 @@
         <w:spacing w:after="80" w:before="160"/>
       </w:pPr>
       <w:r>
-        <w:t xml:space="preserve">3.1.7 Montaje de la espira auxiliar</w:t>
+        <w:t xml:space="preserve">2.1.7 Montaje de la espira auxiliar</w:t>
       </w:r>
     </w:p>
     <w:p>
@@ -2814,7 +2676,7 @@
         <w:spacing w:after="100" w:before="220"/>
       </w:pPr>
       <w:r>
-        <w:t xml:space="preserve">3.2 PROTOCOLO 2 – CALIBRACIÓN</w:t>
+        <w:t xml:space="preserve">2.2 PROTOCOLO 2 – CALIBRACIÓN</w:t>
       </w:r>
     </w:p>
     <w:p>
@@ -2823,7 +2685,7 @@
         <w:jc w:val="both"/>
       </w:pPr>
       <w:r>
-        <w:t xml:space="preserve">Establece la correspondencia entre la señal medida por el captor y una corriente de falla conocida, a partir de la configuración de referencia de la Figura 1. La puesta a tierra se realiza según 3.1.2.</w:t>
+        <w:t xml:space="preserve">Establece la correspondencia entre la señal medida por el captor y una corriente de falla conocida, a partir de la configuración de referencia de la Figura 1. La puesta a tierra se realiza según 2.1.2.</w:t>
       </w:r>
     </w:p>
     <w:p>
@@ -2949,7 +2811,7 @@
         <w:t xml:space="preserve">Tensión por espira.</w:t>
       </w:r>
       <w:r>
-        <w:t xml:space="preserve"> Alimentar el arrollamiento con el Variac y ajustar la tensión hasta que la tensión medida en la espira auxiliar sea igual al valor teórico calculado (apartado 3.4).</w:t>
+        <w:t xml:space="preserve"> Alimentar el arrollamiento con el Variac y ajustar la tensión hasta que la tensión medida en la espira auxiliar sea igual al valor teórico calculado (apartado 2.4).</w:t>
       </w:r>
     </w:p>
     <w:p>
@@ -3121,7 +2983,7 @@
         <w:spacing w:after="100" w:before="220"/>
       </w:pPr>
       <w:r>
-        <w:t xml:space="preserve">3.3 PROTOCOLO 3 – OPERACIÓN DEL SOFTWARE ELCSOFT</w:t>
+        <w:t xml:space="preserve">2.3 PROTOCOLO 3 – OPERACIÓN DEL SOFTWARE ELCSOFT</w:t>
       </w:r>
     </w:p>
     <w:p>
@@ -3140,7 +3002,7 @@
         <w:spacing w:after="80" w:before="160"/>
       </w:pPr>
       <w:r>
-        <w:t xml:space="preserve">3.3.1 Menú principal</w:t>
+        <w:t xml:space="preserve">2.3.1 Menú principal</w:t>
       </w:r>
     </w:p>
     <w:p>
@@ -3362,7 +3224,7 @@
                 <w:sz w:val="19"/>
                 <w:szCs w:val="19"/>
               </w:rPr>
-              <w:t xml:space="preserve">Comienza un nuevo ensayo. Requiere completar los datos de la máquina, del ensayo y la configuración del hardware (3.3.2).</w:t>
+              <w:t xml:space="preserve">Comienza un nuevo ensayo. Requiere completar los datos de la máquina, del ensayo y la configuración del hardware (2.3.2).</w:t>
             </w:r>
           </w:p>
         </w:tc>
@@ -3504,7 +3366,7 @@
                 <w:sz w:val="19"/>
                 <w:szCs w:val="19"/>
               </w:rPr>
-              <w:t xml:space="preserve">Muestra Iq [mA] en función de la posición axial, por ranura (3.3.5).</w:t>
+              <w:t xml:space="preserve">Muestra Iq [mA] en función de la posición axial, por ranura (2.3.5).</w:t>
             </w:r>
           </w:p>
         </w:tc>
@@ -3575,7 +3437,7 @@
                 <w:sz w:val="19"/>
                 <w:szCs w:val="19"/>
               </w:rPr>
-              <w:t xml:space="preserve">Muestra el mapa completo: posición axial, número de ranura y magnitud de Iq (3.3.5).</w:t>
+              <w:t xml:space="preserve">Muestra el mapa completo: posición axial, número de ranura y magnitud de Iq (2.3.5).</w:t>
             </w:r>
           </w:p>
         </w:tc>
@@ -3659,7 +3521,7 @@
         <w:spacing w:after="80" w:before="160"/>
       </w:pPr>
       <w:r>
-        <w:t xml:space="preserve">3.3.2 Parámetros del ensayo</w:t>
+        <w:t xml:space="preserve">2.3.2 Parámetros del ensayo</w:t>
       </w:r>
     </w:p>
     <w:p>
@@ -4544,7 +4406,7 @@
         <w:spacing w:after="80" w:before="160"/>
       </w:pPr>
       <w:r>
-        <w:t xml:space="preserve">3.3.3 Pantalla de adquisición</w:t>
+        <w:t xml:space="preserve">2.3.3 Pantalla de adquisición</w:t>
       </w:r>
     </w:p>
     <w:p>
@@ -5896,7 +5758,7 @@
         <w:spacing w:after="80" w:before="160"/>
       </w:pPr>
       <w:r>
-        <w:t xml:space="preserve">3.3.4 Secuencia de registro</w:t>
+        <w:t xml:space="preserve">2.3.4 Secuencia de registro</w:t>
       </w:r>
     </w:p>
     <w:p>
@@ -6064,7 +5926,7 @@
         <w:spacing w:after="80" w:before="160"/>
       </w:pPr>
       <w:r>
-        <w:t xml:space="preserve">3.3.5 Visualización de resultados</w:t>
+        <w:t xml:space="preserve">2.3.5 Visualización de resultados</w:t>
       </w:r>
     </w:p>
     <w:p>
@@ -6272,7 +6134,7 @@
         <w:spacing w:after="80" w:before="160"/>
       </w:pPr>
       <w:r>
-        <w:t xml:space="preserve">3.3.6 Archivos generados</w:t>
+        <w:t xml:space="preserve">2.3.6 Archivos generados</w:t>
       </w:r>
     </w:p>
     <w:tbl>
@@ -6586,7 +6448,7 @@
         <w:spacing w:after="100" w:before="220"/>
       </w:pPr>
       <w:r>
-        <w:t xml:space="preserve">3.4 APÉNDICE – DETERMINACIÓN DE LA TENSIÓN POR ESPIRA</w:t>
+        <w:t xml:space="preserve">2.4 APÉNDICE – DETERMINACIÓN DE LA TENSIÓN POR ESPIRA</w:t>
       </w:r>
     </w:p>
     <w:p>
@@ -7087,11 +6949,12 @@
         <w:spacing w:after="140" w:before="280"/>
       </w:pPr>
       <w:r>
-        <w:t xml:space="preserve">4. REGISTROS</w:t>
-      </w:r>
-    </w:p>
-    <w:p>
-      <w:pPr>
+        <w:t xml:space="preserve">3. REGISTROS</w:t>
+      </w:r>
+    </w:p>
+    <w:p>
+      <w:pPr>
+        <w:keepNext/>
         <w:spacing w:after="100" w:line="264"/>
         <w:jc w:val="both"/>
       </w:pPr>
@@ -7140,6 +7003,7 @@
           </w:tcPr>
           <w:p>
             <w:pPr>
+              <w:keepNext/>
               <w:spacing w:after="0" w:line="252"/>
               <w:jc w:val="center"/>
             </w:pPr>
@@ -7174,6 +7038,7 @@
           </w:tcPr>
           <w:p>
             <w:pPr>
+              <w:keepNext/>
               <w:spacing w:after="0" w:line="252"/>
               <w:jc w:val="center"/>
             </w:pPr>
@@ -7212,6 +7077,7 @@
           </w:tcPr>
           <w:p>
             <w:pPr>
+              <w:keepNext/>
               <w:spacing w:after="0" w:line="252"/>
               <w:jc w:val="center"/>
             </w:pPr>
@@ -7222,7 +7088,7 @@
                 <w:sz w:val="19"/>
                 <w:szCs w:val="19"/>
               </w:rPr>
-              <w:t xml:space="preserve">A asignar</w:t>
+              <w:t xml:space="preserve"> </w:t>
             </w:r>
           </w:p>
         </w:tc>
@@ -7245,159 +7111,18 @@
           </w:tcPr>
           <w:p>
             <w:pPr>
-              <w:spacing w:after="0" w:line="252"/>
-              <w:jc w:val="left"/>
-            </w:pPr>
-            <w:r>
-              <w:rPr>
-                <w:b w:val="false"/>
-                <w:bCs w:val="false"/>
-                <w:sz w:val="19"/>
-                <w:szCs w:val="19"/>
-              </w:rPr>
-              <w:t xml:space="preserve">Registro de calibración EL CID (tensión por espira, corriente de falla, KF)</w:t>
-            </w:r>
-          </w:p>
-        </w:tc>
-      </w:tr>
-      <w:tr>
-        <w:trPr>
-          <w:cantSplit/>
-        </w:trPr>
-        <w:tc>
-          <w:tcPr>
-            <w:tcW w:type="dxa" w:w="2200"/>
-            <w:tcBorders>
-              <w:top w:val="single" w:color="A6B4B8" w:sz="4"/>
-              <w:left w:val="single" w:color="A6B4B8" w:sz="4"/>
-              <w:bottom w:val="single" w:color="A6B4B8" w:sz="4"/>
-              <w:right w:val="single" w:color="A6B4B8" w:sz="4"/>
-            </w:tcBorders>
-            <w:tcMar>
-              <w:top w:type="dxa" w:w="50"/>
-              <w:left w:type="dxa" w:w="90"/>
-              <w:bottom w:type="dxa" w:w="50"/>
-              <w:right w:type="dxa" w:w="90"/>
-            </w:tcMar>
-            <w:vAlign w:val="top"/>
-          </w:tcPr>
-          <w:p>
-            <w:pPr>
-              <w:spacing w:after="0" w:line="252"/>
-              <w:jc w:val="center"/>
-            </w:pPr>
-            <w:r>
-              <w:rPr>
-                <w:b w:val="false"/>
-                <w:bCs w:val="false"/>
-                <w:sz w:val="19"/>
-                <w:szCs w:val="19"/>
-              </w:rPr>
-              <w:t xml:space="preserve">—</w:t>
-            </w:r>
-          </w:p>
-        </w:tc>
-        <w:tc>
-          <w:tcPr>
-            <w:tcW w:type="dxa" w:w="7438"/>
-            <w:tcBorders>
-              <w:top w:val="single" w:color="A6B4B8" w:sz="4"/>
-              <w:left w:val="single" w:color="A6B4B8" w:sz="4"/>
-              <w:bottom w:val="single" w:color="A6B4B8" w:sz="4"/>
-              <w:right w:val="single" w:color="A6B4B8" w:sz="4"/>
-            </w:tcBorders>
-            <w:tcMar>
-              <w:top w:type="dxa" w:w="50"/>
-              <w:left w:type="dxa" w:w="90"/>
-              <w:bottom w:type="dxa" w:w="50"/>
-              <w:right w:type="dxa" w:w="90"/>
-            </w:tcMar>
-            <w:vAlign w:val="top"/>
-          </w:tcPr>
-          <w:p>
-            <w:pPr>
-              <w:spacing w:after="0" w:line="252"/>
-              <w:jc w:val="left"/>
-            </w:pPr>
-            <w:r>
-              <w:rPr>
-                <w:b w:val="false"/>
-                <w:bCs w:val="false"/>
-                <w:sz w:val="19"/>
-                <w:szCs w:val="19"/>
-              </w:rPr>
-              <w:t xml:space="preserve">Archivos de ensayo ELCSoft: parámetros, matrices Iq e Iqp y registro en bruto (reg)</w:t>
-            </w:r>
-          </w:p>
-        </w:tc>
-      </w:tr>
-      <w:tr>
-        <w:trPr>
-          <w:cantSplit/>
-        </w:trPr>
-        <w:tc>
-          <w:tcPr>
-            <w:tcW w:type="dxa" w:w="2200"/>
-            <w:tcBorders>
-              <w:top w:val="single" w:color="A6B4B8" w:sz="4"/>
-              <w:left w:val="single" w:color="A6B4B8" w:sz="4"/>
-              <w:bottom w:val="single" w:color="A6B4B8" w:sz="4"/>
-              <w:right w:val="single" w:color="A6B4B8" w:sz="4"/>
-            </w:tcBorders>
-            <w:tcMar>
-              <w:top w:type="dxa" w:w="50"/>
-              <w:left w:type="dxa" w:w="90"/>
-              <w:bottom w:type="dxa" w:w="50"/>
-              <w:right w:type="dxa" w:w="90"/>
-            </w:tcMar>
-            <w:vAlign w:val="top"/>
-          </w:tcPr>
-          <w:p>
-            <w:pPr>
-              <w:spacing w:after="0" w:line="252"/>
-              <w:jc w:val="center"/>
-            </w:pPr>
-            <w:r>
-              <w:rPr>
-                <w:b w:val="false"/>
-                <w:bCs w:val="false"/>
-                <w:sz w:val="19"/>
-                <w:szCs w:val="19"/>
-              </w:rPr>
-              <w:t xml:space="preserve">A asignar</w:t>
-            </w:r>
-          </w:p>
-        </w:tc>
-        <w:tc>
-          <w:tcPr>
-            <w:tcW w:type="dxa" w:w="7438"/>
-            <w:tcBorders>
-              <w:top w:val="single" w:color="A6B4B8" w:sz="4"/>
-              <w:left w:val="single" w:color="A6B4B8" w:sz="4"/>
-              <w:bottom w:val="single" w:color="A6B4B8" w:sz="4"/>
-              <w:right w:val="single" w:color="A6B4B8" w:sz="4"/>
-            </w:tcBorders>
-            <w:tcMar>
-              <w:top w:type="dxa" w:w="50"/>
-              <w:left w:type="dxa" w:w="90"/>
-              <w:bottom w:type="dxa" w:w="50"/>
-              <w:right w:type="dxa" w:w="90"/>
-            </w:tcMar>
-            <w:vAlign w:val="top"/>
-          </w:tcPr>
-          <w:p>
-            <w:pPr>
-              <w:spacing w:after="0" w:line="252"/>
-              <w:jc w:val="left"/>
-            </w:pPr>
-            <w:r>
-              <w:rPr>
-                <w:b w:val="false"/>
-                <w:bCs w:val="false"/>
-                <w:sz w:val="19"/>
-                <w:szCs w:val="19"/>
-              </w:rPr>
-              <w:t xml:space="preserve">Memoria de cálculo de la excitación del núcleo (#####-##-EMC###)</w:t>
+              <w:keepNext/>
+              <w:spacing w:after="0" w:line="252"/>
+              <w:jc w:val="left"/>
+            </w:pPr>
+            <w:r>
+              <w:rPr>
+                <w:b w:val="false"/>
+                <w:bCs w:val="false"/>
+                <w:sz w:val="19"/>
+                <w:szCs w:val="19"/>
+              </w:rPr>
+              <w:t xml:space="preserve"> </w:t>
             </w:r>
           </w:p>
         </w:tc>
@@ -7405,7 +7130,8 @@
     </w:tbl>
     <w:p>
       <w:pPr>
-        <w:spacing w:after="200" w:before="0"/>
+        <w:keepNext/>
+        <w:spacing w:after="200"/>
       </w:pPr>
     </w:p>
     <w:tbl>
@@ -7450,6 +7176,7 @@
           </w:tcPr>
           <w:p>
             <w:pPr>
+              <w:keepNext/>
               <w:spacing w:after="0" w:line="252"/>
               <w:jc w:val="left"/>
             </w:pPr>
@@ -7484,6 +7211,7 @@
           </w:tcPr>
           <w:p>
             <w:pPr>
+              <w:keepNext/>
               <w:spacing w:after="0" w:line="252"/>
               <w:jc w:val="left"/>
             </w:pPr>
@@ -7518,6 +7246,7 @@
           </w:tcPr>
           <w:p>
             <w:pPr>
+              <w:keepNext/>
               <w:spacing w:after="0" w:line="252"/>
               <w:jc w:val="left"/>
             </w:pPr>
@@ -7556,17 +7285,18 @@
           </w:tcPr>
           <w:p>
             <w:pPr>
-              <w:spacing w:after="0" w:line="252"/>
-              <w:jc w:val="left"/>
-            </w:pPr>
-            <w:r>
-              <w:rPr>
-                <w:b w:val="false"/>
-                <w:bCs w:val="false"/>
-                <w:sz w:val="19"/>
-                <w:szCs w:val="19"/>
-              </w:rPr>
-              <w:t xml:space="preserve">N° 00</w:t>
+              <w:keepNext/>
+              <w:spacing w:after="0" w:line="252"/>
+              <w:jc w:val="left"/>
+            </w:pPr>
+            <w:r>
+              <w:rPr>
+                <w:b w:val="false"/>
+                <w:bCs w:val="false"/>
+                <w:sz w:val="19"/>
+                <w:szCs w:val="19"/>
+              </w:rPr>
+              <w:t xml:space="preserve">00</w:t>
             </w:r>
           </w:p>
         </w:tc>
@@ -7589,17 +7319,18 @@
           </w:tcPr>
           <w:p>
             <w:pPr>
-              <w:spacing w:after="0" w:line="252"/>
-              <w:jc w:val="left"/>
-            </w:pPr>
-            <w:r>
-              <w:rPr>
-                <w:b w:val="false"/>
-                <w:bCs w:val="false"/>
-                <w:sz w:val="19"/>
-                <w:szCs w:val="19"/>
-              </w:rPr>
-              <w:t xml:space="preserve">26/10/2026</w:t>
+              <w:keepNext/>
+              <w:spacing w:after="0" w:line="252"/>
+              <w:jc w:val="left"/>
+            </w:pPr>
+            <w:r>
+              <w:rPr>
+                <w:b w:val="false"/>
+                <w:bCs w:val="false"/>
+                <w:sz w:val="19"/>
+                <w:szCs w:val="19"/>
+              </w:rPr>
+              <w:t xml:space="preserve">28/10/2026</w:t>
             </w:r>
           </w:p>
         </w:tc>
@@ -7622,6 +7353,7 @@
           </w:tcPr>
           <w:p>
             <w:pPr>
+              <w:keepNext/>
               <w:spacing w:after="0" w:line="252"/>
               <w:jc w:val="left"/>
             </w:pPr>
@@ -7640,7 +7372,8 @@
     </w:tbl>
     <w:p>
       <w:pPr>
-        <w:spacing w:after="200" w:before="0"/>
+        <w:keepNext/>
+        <w:spacing w:after="200"/>
       </w:pPr>
     </w:p>
     <w:tbl>
@@ -7686,6 +7419,7 @@
           </w:tcPr>
           <w:p>
             <w:pPr>
+              <w:keepNext/>
               <w:spacing w:after="0" w:line="252"/>
               <w:jc w:val="left"/>
             </w:pPr>
@@ -7720,6 +7454,7 @@
           </w:tcPr>
           <w:p>
             <w:pPr>
+              <w:keepNext/>
               <w:spacing w:after="0" w:line="252"/>
               <w:jc w:val="left"/>
             </w:pPr>
@@ -7754,6 +7489,7 @@
           </w:tcPr>
           <w:p>
             <w:pPr>
+              <w:keepNext/>
               <w:spacing w:after="0" w:line="252"/>
               <w:jc w:val="left"/>
             </w:pPr>
@@ -7788,6 +7524,7 @@
           </w:tcPr>
           <w:p>
             <w:pPr>
+              <w:keepNext/>
               <w:spacing w:after="0" w:line="252"/>
               <w:jc w:val="left"/>
             </w:pPr>
@@ -7826,6 +7563,7 @@
           </w:tcPr>
           <w:p>
             <w:pPr>
+              <w:keepNext/>
               <w:spacing w:after="0" w:line="252"/>
               <w:jc w:val="left"/>
             </w:pPr>
@@ -7850,6 +7588,7 @@
           </w:tcPr>
           <w:p>
             <w:pPr>
+              <w:keepNext/>
               <w:spacing w:after="0" w:line="252"/>
               <w:jc w:val="left"/>
             </w:pPr>
@@ -7874,6 +7613,7 @@
           </w:tcPr>
           <w:p>
             <w:pPr>
+              <w:keepNext/>
               <w:spacing w:after="0" w:line="252"/>
               <w:jc w:val="left"/>
             </w:pPr>
@@ -7898,6 +7638,7 @@
           </w:tcPr>
           <w:p>
             <w:pPr>
+              <w:keepNext/>
               <w:spacing w:after="0" w:line="252"/>
               <w:jc w:val="left"/>
             </w:pPr>
@@ -7907,7 +7648,8 @@
     </w:tbl>
     <w:p>
       <w:pPr>
-        <w:spacing w:after="200" w:before="0"/>
+        <w:keepNext/>
+        <w:spacing w:after="200"/>
       </w:pPr>
     </w:p>
     <w:tbl>
@@ -7950,6 +7692,7 @@
           </w:tcPr>
           <w:p>
             <w:pPr>
+              <w:keepNext/>
               <w:spacing w:after="0" w:line="252"/>
               <w:jc w:val="left"/>
             </w:pPr>
@@ -7988,131 +7731,18 @@
           </w:tcPr>
           <w:p>
             <w:pPr>
-              <w:spacing w:after="0" w:line="252"/>
-              <w:jc w:val="left"/>
-            </w:pPr>
-            <w:r>
-              <w:rPr>
-                <w:b w:val="false"/>
-                <w:bCs w:val="false"/>
-                <w:sz w:val="19"/>
-                <w:szCs w:val="19"/>
-              </w:rPr>
-              <w:t xml:space="preserve">Norma ISO 9001:2015</w:t>
-            </w:r>
-          </w:p>
-        </w:tc>
-      </w:tr>
-      <w:tr>
-        <w:trPr>
-          <w:cantSplit/>
-        </w:trPr>
-        <w:tc>
-          <w:tcPr>
-            <w:tcW w:type="dxa" w:w="9638"/>
-            <w:tcBorders>
-              <w:top w:val="single" w:color="A6B4B8" w:sz="4"/>
-              <w:left w:val="single" w:color="A6B4B8" w:sz="4"/>
-              <w:bottom w:val="single" w:color="A6B4B8" w:sz="4"/>
-              <w:right w:val="single" w:color="A6B4B8" w:sz="4"/>
-            </w:tcBorders>
-            <w:tcMar>
-              <w:top w:type="dxa" w:w="50"/>
-              <w:left w:type="dxa" w:w="90"/>
-              <w:bottom w:type="dxa" w:w="50"/>
-              <w:right w:type="dxa" w:w="90"/>
-            </w:tcMar>
-            <w:vAlign w:val="top"/>
-          </w:tcPr>
-          <w:p>
-            <w:pPr>
-              <w:spacing w:after="0" w:line="252"/>
-              <w:jc w:val="left"/>
-            </w:pPr>
-            <w:r>
-              <w:rPr>
-                <w:b w:val="false"/>
-                <w:bCs w:val="false"/>
-                <w:sz w:val="19"/>
-                <w:szCs w:val="19"/>
-              </w:rPr>
-              <w:t xml:space="preserve">00503-00-EPG001 – Procedimiento de inspección robotizada GRIS</w:t>
-            </w:r>
-          </w:p>
-        </w:tc>
-      </w:tr>
-      <w:tr>
-        <w:trPr>
-          <w:cantSplit/>
-        </w:trPr>
-        <w:tc>
-          <w:tcPr>
-            <w:tcW w:type="dxa" w:w="9638"/>
-            <w:tcBorders>
-              <w:top w:val="single" w:color="A6B4B8" w:sz="4"/>
-              <w:left w:val="single" w:color="A6B4B8" w:sz="4"/>
-              <w:bottom w:val="single" w:color="A6B4B8" w:sz="4"/>
-              <w:right w:val="single" w:color="A6B4B8" w:sz="4"/>
-            </w:tcBorders>
-            <w:tcMar>
-              <w:top w:type="dxa" w:w="50"/>
-              <w:left w:type="dxa" w:w="90"/>
-              <w:bottom w:type="dxa" w:w="50"/>
-              <w:right w:type="dxa" w:w="90"/>
-            </w:tcMar>
-            <w:vAlign w:val="top"/>
-          </w:tcPr>
-          <w:p>
-            <w:pPr>
-              <w:spacing w:after="0" w:line="252"/>
-              <w:jc w:val="left"/>
-            </w:pPr>
-            <w:r>
-              <w:rPr>
-                <w:b w:val="false"/>
-                <w:bCs w:val="false"/>
-                <w:sz w:val="19"/>
-                <w:szCs w:val="19"/>
-              </w:rPr>
-              <w:t xml:space="preserve">Protocolos de ensayo ELCID robotizado – Nexergy Corp., junio 2025 (Tarea N° 19, Producto N° 7)</w:t>
-            </w:r>
-          </w:p>
-        </w:tc>
-      </w:tr>
-      <w:tr>
-        <w:trPr>
-          <w:cantSplit/>
-        </w:trPr>
-        <w:tc>
-          <w:tcPr>
-            <w:tcW w:type="dxa" w:w="9638"/>
-            <w:tcBorders>
-              <w:top w:val="single" w:color="A6B4B8" w:sz="4"/>
-              <w:left w:val="single" w:color="A6B4B8" w:sz="4"/>
-              <w:bottom w:val="single" w:color="A6B4B8" w:sz="4"/>
-              <w:right w:val="single" w:color="A6B4B8" w:sz="4"/>
-            </w:tcBorders>
-            <w:tcMar>
-              <w:top w:type="dxa" w:w="50"/>
-              <w:left w:type="dxa" w:w="90"/>
-              <w:bottom w:type="dxa" w:w="50"/>
-              <w:right w:type="dxa" w:w="90"/>
-            </w:tcMar>
-            <w:vAlign w:val="top"/>
-          </w:tcPr>
-          <w:p>
-            <w:pPr>
-              <w:spacing w:after="0" w:line="252"/>
-              <w:jc w:val="left"/>
-            </w:pPr>
-            <w:r>
-              <w:rPr>
-                <w:b w:val="false"/>
-                <w:bCs w:val="false"/>
-                <w:sz w:val="19"/>
-                <w:szCs w:val="19"/>
-              </w:rPr>
-              <w:t xml:space="preserve">IEEE Std 56-2016 – Guide for Insulation Maintenance of Electric Machines</w:t>
+              <w:keepNext/>
+              <w:spacing w:after="0" w:line="252"/>
+              <w:jc w:val="left"/>
+            </w:pPr>
+            <w:r>
+              <w:rPr>
+                <w:b w:val="false"/>
+                <w:bCs w:val="false"/>
+                <w:sz w:val="19"/>
+                <w:szCs w:val="19"/>
+              </w:rPr>
+              <w:t xml:space="preserve"> </w:t>
             </w:r>
           </w:p>
         </w:tc>
@@ -8632,7 +8262,7 @@
               <w:sz w:val="16"/>
               <w:szCs w:val="16"/>
             </w:rPr>
-            <w:t xml:space="preserve">26/10/2026</w:t>
+            <w:t xml:space="preserve">28/10/2026</w:t>
           </w:r>
         </w:p>
       </w:tc>

</xml_diff>